<commit_message>
se agrego lo ultimo del docuemnto
</commit_message>
<xml_diff>
--- a/informe_unidad1.docx
+++ b/informe_unidad1.docx
@@ -672,6 +672,16 @@
           <w:szCs w:val="32"/>
         </w:rPr>
       </w:pPr>
+      <w:r>
+        <w:rPr>
+          <w:rFonts w:ascii="Arial" w:hAnsi="Arial" w:cs="Arial"/>
+          <w:color w:val="103654"/>
+          <w:sz w:val="32"/>
+          <w:szCs w:val="32"/>
+          <w:lang w:val="en-US"/>
+        </w:rPr>
+        <w:t>MSc. Marcelo Vasquez</w:t>
+      </w:r>
     </w:p>
     <w:p>
       <w:pPr>
@@ -747,7 +757,7 @@
           <w14:ligatures w14:val="standardContextual"/>
         </w:rPr>
         <w:drawing>
-          <wp:anchor distT="0" distB="0" distL="114300" distR="114300" simplePos="0" relativeHeight="251658241" behindDoc="0" locked="0" layoutInCell="1" allowOverlap="1" wp14:anchorId="09CE0197" wp14:editId="5CB56667">
+          <wp:anchor distT="0" distB="0" distL="114300" distR="114300" simplePos="0" relativeHeight="251658241" behindDoc="0" locked="0" layoutInCell="1" allowOverlap="1" wp14:anchorId="09CE0197" wp14:editId="1D826F6C">
             <wp:simplePos x="0" y="0"/>
             <wp:positionH relativeFrom="margin">
               <wp:posOffset>-819807</wp:posOffset>
@@ -807,8 +817,6 @@
       <w:sdtPr>
         <w:rPr>
           <w:rFonts w:ascii="Trebuchet MS" w:eastAsiaTheme="minorEastAsia" w:hAnsi="Trebuchet MS" w:cstheme="minorBidi"/>
-          <w:b w:val="0"/>
-          <w:bCs w:val="0"/>
           <w:color w:val="auto"/>
           <w:sz w:val="22"/>
           <w:szCs w:val="22"/>
@@ -820,6 +828,12 @@
           <w:docPartUnique/>
         </w:docPartObj>
       </w:sdtPr>
+      <w:sdtEndPr>
+        <w:rPr>
+          <w:b w:val="0"/>
+          <w:bCs w:val="0"/>
+        </w:rPr>
+      </w:sdtEndPr>
       <w:sdtContent>
         <w:p>
           <w:pPr>
@@ -844,7 +858,7 @@
               <w:kern w:val="2"/>
               <w:sz w:val="24"/>
               <w:szCs w:val="24"/>
-              <w:lang w:val="es-NI" w:eastAsia="es-NI"/>
+              <w:lang w:val="es-ES" w:eastAsia="es-ES"/>
               <w14:ligatures w14:val="standardContextual"/>
             </w:rPr>
           </w:pPr>
@@ -857,13 +871,13 @@
           <w:r>
             <w:fldChar w:fldCharType="separate"/>
           </w:r>
-          <w:hyperlink w:anchor="_Toc229847660" w:history="1">
+          <w:hyperlink w:anchor="_Toc237600721" w:history="1">
             <w:r>
               <w:rPr>
                 <w:rStyle w:val="Hipervnculo"/>
                 <w:noProof/>
               </w:rPr>
-              <w:t>Tema de la investigación</w:t>
+              <w:t>Tema:</w:t>
             </w:r>
             <w:r>
               <w:rPr>
@@ -884,7 +898,7 @@
                 <w:noProof/>
                 <w:webHidden/>
               </w:rPr>
-              <w:instrText xml:space="preserve"> PAGEREF _Toc229847660 \h </w:instrText>
+              <w:instrText xml:space="preserve"> PAGEREF _Toc237600721 \h </w:instrText>
             </w:r>
             <w:r>
               <w:rPr>
@@ -930,17 +944,17 @@
               <w:kern w:val="2"/>
               <w:sz w:val="24"/>
               <w:szCs w:val="24"/>
-              <w:lang w:val="es-NI" w:eastAsia="es-NI"/>
+              <w:lang w:val="es-ES" w:eastAsia="es-ES"/>
               <w14:ligatures w14:val="standardContextual"/>
             </w:rPr>
           </w:pPr>
-          <w:hyperlink w:anchor="_Toc229847661" w:history="1">
+          <w:hyperlink w:anchor="_Toc237600722" w:history="1">
             <w:r>
               <w:rPr>
                 <w:rStyle w:val="Hipervnculo"/>
                 <w:noProof/>
               </w:rPr>
-              <w:t>Introducción</w:t>
+              <w:t>Introducción:</w:t>
             </w:r>
             <w:r>
               <w:rPr>
@@ -961,7 +975,7 @@
                 <w:noProof/>
                 <w:webHidden/>
               </w:rPr>
-              <w:instrText xml:space="preserve"> PAGEREF _Toc229847661 \h </w:instrText>
+              <w:instrText xml:space="preserve"> PAGEREF _Toc237600722 \h </w:instrText>
             </w:r>
             <w:r>
               <w:rPr>
@@ -1007,17 +1021,17 @@
               <w:kern w:val="2"/>
               <w:sz w:val="24"/>
               <w:szCs w:val="24"/>
-              <w:lang w:val="es-NI" w:eastAsia="es-NI"/>
+              <w:lang w:val="es-ES" w:eastAsia="es-ES"/>
               <w14:ligatures w14:val="standardContextual"/>
             </w:rPr>
           </w:pPr>
-          <w:hyperlink w:anchor="_Toc229847662" w:history="1">
+          <w:hyperlink w:anchor="_Toc237600723" w:history="1">
             <w:r>
               <w:rPr>
                 <w:rStyle w:val="Hipervnculo"/>
                 <w:noProof/>
               </w:rPr>
-              <w:t>Objetivo General</w:t>
+              <w:t>Pseudo código de tu algoritmo:</w:t>
             </w:r>
             <w:r>
               <w:rPr>
@@ -1038,7 +1052,7 @@
                 <w:noProof/>
                 <w:webHidden/>
               </w:rPr>
-              <w:instrText xml:space="preserve"> PAGEREF _Toc229847662 \h </w:instrText>
+              <w:instrText xml:space="preserve"> PAGEREF _Toc237600723 \h </w:instrText>
             </w:r>
             <w:r>
               <w:rPr>
@@ -1058,7 +1072,7 @@
                 <w:noProof/>
                 <w:webHidden/>
               </w:rPr>
-              <w:t>1</w:t>
+              <w:t>2</w:t>
             </w:r>
             <w:r>
               <w:rPr>
@@ -1084,17 +1098,17 @@
               <w:kern w:val="2"/>
               <w:sz w:val="24"/>
               <w:szCs w:val="24"/>
-              <w:lang w:val="es-NI" w:eastAsia="es-NI"/>
+              <w:lang w:val="es-ES" w:eastAsia="es-ES"/>
               <w14:ligatures w14:val="standardContextual"/>
             </w:rPr>
           </w:pPr>
-          <w:hyperlink w:anchor="_Toc229847663" w:history="1">
+          <w:hyperlink w:anchor="_Toc237600724" w:history="1">
             <w:r>
               <w:rPr>
                 <w:rStyle w:val="Hipervnculo"/>
                 <w:noProof/>
               </w:rPr>
-              <w:t>Objetivos Específicos</w:t>
+              <w:t>Enlace del repositorio:</w:t>
             </w:r>
             <w:r>
               <w:rPr>
@@ -1115,7 +1129,7 @@
                 <w:noProof/>
                 <w:webHidden/>
               </w:rPr>
-              <w:instrText xml:space="preserve"> PAGEREF _Toc229847663 \h </w:instrText>
+              <w:instrText xml:space="preserve"> PAGEREF _Toc237600724 \h </w:instrText>
             </w:r>
             <w:r>
               <w:rPr>
@@ -1135,7 +1149,7 @@
                 <w:noProof/>
                 <w:webHidden/>
               </w:rPr>
-              <w:t>1</w:t>
+              <w:t>3</w:t>
             </w:r>
             <w:r>
               <w:rPr>
@@ -1161,17 +1175,17 @@
               <w:kern w:val="2"/>
               <w:sz w:val="24"/>
               <w:szCs w:val="24"/>
-              <w:lang w:val="es-NI" w:eastAsia="es-NI"/>
+              <w:lang w:val="es-ES" w:eastAsia="es-ES"/>
               <w14:ligatures w14:val="standardContextual"/>
             </w:rPr>
           </w:pPr>
-          <w:hyperlink w:anchor="_Toc229847664" w:history="1">
+          <w:hyperlink w:anchor="_Toc237600725" w:history="1">
             <w:r>
               <w:rPr>
                 <w:rStyle w:val="Hipervnculo"/>
                 <w:noProof/>
               </w:rPr>
-              <w:t>Antecedentes</w:t>
+              <w:t>Bibliografía consultada:</w:t>
             </w:r>
             <w:r>
               <w:rPr>
@@ -1192,7 +1206,7 @@
                 <w:noProof/>
                 <w:webHidden/>
               </w:rPr>
-              <w:instrText xml:space="preserve"> PAGEREF _Toc229847664 \h </w:instrText>
+              <w:instrText xml:space="preserve"> PAGEREF _Toc237600725 \h </w:instrText>
             </w:r>
             <w:r>
               <w:rPr>
@@ -1212,315 +1226,7 @@
                 <w:noProof/>
                 <w:webHidden/>
               </w:rPr>
-              <w:t>1</w:t>
-            </w:r>
-            <w:r>
-              <w:rPr>
-                <w:noProof/>
-                <w:webHidden/>
-              </w:rPr>
-              <w:fldChar w:fldCharType="end"/>
-            </w:r>
-          </w:hyperlink>
-        </w:p>
-        <w:p>
-          <w:pPr>
-            <w:pStyle w:val="TDC1"/>
-            <w:tabs>
-              <w:tab w:val="right" w:leader="dot" w:pos="8828"/>
-            </w:tabs>
-            <w:rPr>
-              <w:rFonts w:eastAsiaTheme="minorEastAsia"/>
-              <w:b w:val="0"/>
-              <w:bCs w:val="0"/>
-              <w:caps w:val="0"/>
-              <w:noProof/>
-              <w:kern w:val="2"/>
-              <w:sz w:val="24"/>
-              <w:szCs w:val="24"/>
-              <w:lang w:val="es-NI" w:eastAsia="es-NI"/>
-              <w14:ligatures w14:val="standardContextual"/>
-            </w:rPr>
-          </w:pPr>
-          <w:hyperlink w:anchor="_Toc229847665" w:history="1">
-            <w:r>
-              <w:rPr>
-                <w:rStyle w:val="Hipervnculo"/>
-                <w:noProof/>
-              </w:rPr>
-              <w:t>Descripción de la solución y sus funcionalidades</w:t>
-            </w:r>
-            <w:r>
-              <w:rPr>
-                <w:noProof/>
-                <w:webHidden/>
-              </w:rPr>
-              <w:tab/>
-            </w:r>
-            <w:r>
-              <w:rPr>
-                <w:noProof/>
-                <w:webHidden/>
-              </w:rPr>
-              <w:fldChar w:fldCharType="begin"/>
-            </w:r>
-            <w:r>
-              <w:rPr>
-                <w:noProof/>
-                <w:webHidden/>
-              </w:rPr>
-              <w:instrText xml:space="preserve"> PAGEREF _Toc229847665 \h </w:instrText>
-            </w:r>
-            <w:r>
-              <w:rPr>
-                <w:noProof/>
-                <w:webHidden/>
-              </w:rPr>
-            </w:r>
-            <w:r>
-              <w:rPr>
-                <w:noProof/>
-                <w:webHidden/>
-              </w:rPr>
-              <w:fldChar w:fldCharType="separate"/>
-            </w:r>
-            <w:r>
-              <w:rPr>
-                <w:noProof/>
-                <w:webHidden/>
-              </w:rPr>
-              <w:t>1</w:t>
-            </w:r>
-            <w:r>
-              <w:rPr>
-                <w:noProof/>
-                <w:webHidden/>
-              </w:rPr>
-              <w:fldChar w:fldCharType="end"/>
-            </w:r>
-          </w:hyperlink>
-        </w:p>
-        <w:p>
-          <w:pPr>
-            <w:pStyle w:val="TDC1"/>
-            <w:tabs>
-              <w:tab w:val="right" w:leader="dot" w:pos="8828"/>
-            </w:tabs>
-            <w:rPr>
-              <w:rFonts w:eastAsiaTheme="minorEastAsia"/>
-              <w:b w:val="0"/>
-              <w:bCs w:val="0"/>
-              <w:caps w:val="0"/>
-              <w:noProof/>
-              <w:kern w:val="2"/>
-              <w:sz w:val="24"/>
-              <w:szCs w:val="24"/>
-              <w:lang w:val="es-NI" w:eastAsia="es-NI"/>
-              <w14:ligatures w14:val="standardContextual"/>
-            </w:rPr>
-          </w:pPr>
-          <w:hyperlink w:anchor="_Toc229847666" w:history="1">
-            <w:r>
-              <w:rPr>
-                <w:rStyle w:val="Hipervnculo"/>
-                <w:noProof/>
-              </w:rPr>
-              <w:t>Tablas del proyecto</w:t>
-            </w:r>
-            <w:r>
-              <w:rPr>
-                <w:noProof/>
-                <w:webHidden/>
-              </w:rPr>
-              <w:tab/>
-            </w:r>
-            <w:r>
-              <w:rPr>
-                <w:noProof/>
-                <w:webHidden/>
-              </w:rPr>
-              <w:fldChar w:fldCharType="begin"/>
-            </w:r>
-            <w:r>
-              <w:rPr>
-                <w:noProof/>
-                <w:webHidden/>
-              </w:rPr>
-              <w:instrText xml:space="preserve"> PAGEREF _Toc229847666 \h </w:instrText>
-            </w:r>
-            <w:r>
-              <w:rPr>
-                <w:noProof/>
-                <w:webHidden/>
-              </w:rPr>
-            </w:r>
-            <w:r>
-              <w:rPr>
-                <w:noProof/>
-                <w:webHidden/>
-              </w:rPr>
-              <w:fldChar w:fldCharType="separate"/>
-            </w:r>
-            <w:r>
-              <w:rPr>
-                <w:noProof/>
-                <w:webHidden/>
-              </w:rPr>
-              <w:t>1</w:t>
-            </w:r>
-            <w:r>
-              <w:rPr>
-                <w:noProof/>
-                <w:webHidden/>
-              </w:rPr>
-              <w:fldChar w:fldCharType="end"/>
-            </w:r>
-          </w:hyperlink>
-        </w:p>
-        <w:p>
-          <w:pPr>
-            <w:pStyle w:val="TDC1"/>
-            <w:tabs>
-              <w:tab w:val="right" w:leader="dot" w:pos="8828"/>
-            </w:tabs>
-            <w:rPr>
-              <w:rFonts w:eastAsiaTheme="minorEastAsia"/>
-              <w:b w:val="0"/>
-              <w:bCs w:val="0"/>
-              <w:caps w:val="0"/>
-              <w:noProof/>
-              <w:kern w:val="2"/>
-              <w:sz w:val="24"/>
-              <w:szCs w:val="24"/>
-              <w:lang w:val="es-NI" w:eastAsia="es-NI"/>
-              <w14:ligatures w14:val="standardContextual"/>
-            </w:rPr>
-          </w:pPr>
-          <w:hyperlink w:anchor="_Toc229847667" w:history="1">
-            <w:r>
-              <w:rPr>
-                <w:rStyle w:val="Hipervnculo"/>
-                <w:noProof/>
-              </w:rPr>
-              <w:t>Interfaces de usuario (Pantallas)</w:t>
-            </w:r>
-            <w:r>
-              <w:rPr>
-                <w:noProof/>
-                <w:webHidden/>
-              </w:rPr>
-              <w:tab/>
-            </w:r>
-            <w:r>
-              <w:rPr>
-                <w:noProof/>
-                <w:webHidden/>
-              </w:rPr>
-              <w:fldChar w:fldCharType="begin"/>
-            </w:r>
-            <w:r>
-              <w:rPr>
-                <w:noProof/>
-                <w:webHidden/>
-              </w:rPr>
-              <w:instrText xml:space="preserve"> PAGEREF _Toc229847667 \h </w:instrText>
-            </w:r>
-            <w:r>
-              <w:rPr>
-                <w:noProof/>
-                <w:webHidden/>
-              </w:rPr>
-            </w:r>
-            <w:r>
-              <w:rPr>
-                <w:noProof/>
-                <w:webHidden/>
-              </w:rPr>
-              <w:fldChar w:fldCharType="separate"/>
-            </w:r>
-            <w:r>
-              <w:rPr>
-                <w:noProof/>
-                <w:webHidden/>
-              </w:rPr>
-              <w:t>1</w:t>
-            </w:r>
-            <w:r>
-              <w:rPr>
-                <w:noProof/>
-                <w:webHidden/>
-              </w:rPr>
-              <w:fldChar w:fldCharType="end"/>
-            </w:r>
-          </w:hyperlink>
-        </w:p>
-        <w:p>
-          <w:pPr>
-            <w:pStyle w:val="TDC1"/>
-            <w:tabs>
-              <w:tab w:val="right" w:leader="dot" w:pos="8828"/>
-            </w:tabs>
-            <w:rPr>
-              <w:rFonts w:eastAsiaTheme="minorEastAsia"/>
-              <w:b w:val="0"/>
-              <w:bCs w:val="0"/>
-              <w:caps w:val="0"/>
-              <w:noProof/>
-              <w:kern w:val="2"/>
-              <w:sz w:val="24"/>
-              <w:szCs w:val="24"/>
-              <w:lang w:val="es-NI" w:eastAsia="es-NI"/>
-              <w14:ligatures w14:val="standardContextual"/>
-            </w:rPr>
-          </w:pPr>
-          <w:hyperlink w:anchor="_Toc229847668" w:history="1">
-            <w:r>
-              <w:rPr>
-                <w:rStyle w:val="Hipervnculo"/>
-                <w:noProof/>
-              </w:rPr>
-              <w:t>Bibliografía</w:t>
-            </w:r>
-            <w:r>
-              <w:rPr>
-                <w:noProof/>
-                <w:webHidden/>
-              </w:rPr>
-              <w:tab/>
-            </w:r>
-            <w:r>
-              <w:rPr>
-                <w:noProof/>
-                <w:webHidden/>
-              </w:rPr>
-              <w:fldChar w:fldCharType="begin"/>
-            </w:r>
-            <w:r>
-              <w:rPr>
-                <w:noProof/>
-                <w:webHidden/>
-              </w:rPr>
-              <w:instrText xml:space="preserve"> PAGEREF _Toc229847668 \h </w:instrText>
-            </w:r>
-            <w:r>
-              <w:rPr>
-                <w:noProof/>
-                <w:webHidden/>
-              </w:rPr>
-            </w:r>
-            <w:r>
-              <w:rPr>
-                <w:noProof/>
-                <w:webHidden/>
-              </w:rPr>
-              <w:fldChar w:fldCharType="separate"/>
-            </w:r>
-            <w:r>
-              <w:rPr>
-                <w:noProof/>
-                <w:webHidden/>
-              </w:rPr>
-              <w:t>1</w:t>
+              <w:t>3</w:t>
             </w:r>
             <w:r>
               <w:rPr>
@@ -1669,16 +1375,39 @@
         <w:pStyle w:val="Ttulo1"/>
       </w:pPr>
       <w:bookmarkStart w:id="0" w:name="_Toc195415061"/>
-      <w:bookmarkStart w:id="1" w:name="_Toc229847660"/>
+      <w:bookmarkStart w:id="1" w:name="_Toc237600721"/>
       <w:r>
         <w:lastRenderedPageBreak/>
         <w:t>Tema</w:t>
       </w:r>
       <w:bookmarkEnd w:id="0"/>
+      <w:r>
+        <w:t>:</w:t>
+      </w:r>
       <w:bookmarkEnd w:id="1"/>
+    </w:p>
+    <w:p>
+      <w:pPr>
+        <w:rPr>
+          <w:lang w:val="es-NI"/>
+        </w:rPr>
+      </w:pPr>
+      <w:r>
+        <w:t>Control y cálculo del promedio académico de una materia mediante Programación Orientada a Objetos, herencia, polimorfismo y manejo de excepciones.</w:t>
+      </w:r>
+    </w:p>
+    <w:p>
+      <w:pPr>
+        <w:pStyle w:val="Ttulo1"/>
+      </w:pPr>
+      <w:bookmarkStart w:id="2" w:name="_Toc237600722"/>
+      <w:r>
+        <w:t>Introducción</w:t>
+      </w:r>
       <w:r>
         <w:t>:</w:t>
       </w:r>
+      <w:bookmarkEnd w:id="2"/>
     </w:p>
     <w:p>
       <w:pPr>
@@ -1690,46 +1419,76 @@
         <w:rPr>
           <w:lang w:val="es-ES"/>
         </w:rPr>
-        <w:t>Control y cálculo del promedio académico de una materia mediante estructuras de control, funciones y manejo de excepciones.</w:t>
-      </w:r>
-    </w:p>
-    <w:p>
-      <w:pPr>
-        <w:pStyle w:val="Ttulo1"/>
-      </w:pPr>
-      <w:bookmarkStart w:id="2" w:name="_Toc229847661"/>
-      <w:r>
-        <w:t>Introducción</w:t>
-      </w:r>
-      <w:bookmarkEnd w:id="2"/>
-      <w:r>
-        <w:t>:</w:t>
-      </w:r>
-    </w:p>
-    <w:p>
-      <w:pPr>
+        <w:t>El presente trabajo aborda el desarrollo de un algoritmo para el componente de Programación con Estructuras de Datos. Su objetivo principal es aplicar conceptos fundamentales y avanzados de desarrollo de software, escalando la solución mediante el paradigma de Programación Orientada a Objetos (</w:t>
+      </w:r>
+      <w:proofErr w:type="spellStart"/>
+      <w:r>
         <w:rPr>
           <w:lang w:val="es-ES"/>
         </w:rPr>
-      </w:pPr>
+        <w:t>Lott</w:t>
+      </w:r>
+      <w:proofErr w:type="spellEnd"/>
       <w:r>
         <w:rPr>
           <w:lang w:val="es-ES"/>
         </w:rPr>
-        <w:t xml:space="preserve">El presente trabajo aborda el desarrollo de un algoritmo para el componente de Programación con Estructuras de Datos en la carrera de Ingeniería en Sistemas de Información. Su objetivo principal es aplicar conceptos fundamentales de desarrollo de software como el modularidad mediante funciones, la iteración con estructuras de control y la solidez del programa a través de la captura de errores o manejo de excepciones. </w:t>
-      </w:r>
-    </w:p>
-    <w:p>
-      <w:pPr>
+        <w:t xml:space="preserve"> y Phillips, 2021). A través de la implementación de clases (Python Software </w:t>
+      </w:r>
+      <w:proofErr w:type="spellStart"/>
+      <w:r>
         <w:rPr>
           <w:lang w:val="es-ES"/>
         </w:rPr>
-      </w:pPr>
+        <w:t>Foundation</w:t>
+      </w:r>
+      <w:proofErr w:type="spellEnd"/>
       <w:r>
         <w:rPr>
           <w:lang w:val="es-ES"/>
         </w:rPr>
-        <w:t xml:space="preserve">La solución propuesta consiste en una herramienta interactiva que automatiza el registro, cálculo y análisis de calificaciones estudiantiles para una asignatura específica, permitiendo un seguimiento claro del rendimiento académico a lo largo del periodo lectivo. </w:t>
+        <w:t>, 2024a), principios de herencia y polimorfismo, sumado al uso de iteraciones (</w:t>
+      </w:r>
+      <w:proofErr w:type="spellStart"/>
+      <w:r>
+        <w:rPr>
+          <w:lang w:val="es-ES"/>
+        </w:rPr>
+        <w:t>Matthes</w:t>
+      </w:r>
+      <w:proofErr w:type="spellEnd"/>
+      <w:r>
+        <w:rPr>
+          <w:lang w:val="es-ES"/>
+        </w:rPr>
+        <w:t xml:space="preserve">, 2023) y una rigurosa captura de errores (Python Software </w:t>
+      </w:r>
+      <w:proofErr w:type="spellStart"/>
+      <w:r>
+        <w:rPr>
+          <w:lang w:val="es-ES"/>
+        </w:rPr>
+        <w:t>Foundation</w:t>
+      </w:r>
+      <w:proofErr w:type="spellEnd"/>
+      <w:r>
+        <w:rPr>
+          <w:lang w:val="es-ES"/>
+        </w:rPr>
+        <w:t>, 2024b), el sistema garantiza un alto nivel de modularidad y solidez.</w:t>
+      </w:r>
+    </w:p>
+    <w:p>
+      <w:pPr>
+        <w:rPr>
+          <w:lang w:val="es-ES"/>
+        </w:rPr>
+      </w:pPr>
+      <w:r>
+        <w:rPr>
+          <w:lang w:val="es-ES"/>
+        </w:rPr>
+        <w:t>La solución propuesta consiste en una herramienta interactiva que automatiza el registro, cálculo y análisis de calificaciones estudiantiles para una asignatura específica, permitiendo un seguimiento claro y preciso del rendimiento académico a lo largo del periodo lectivo.</w:t>
       </w:r>
     </w:p>
     <w:p>
@@ -1758,15 +1517,178 @@
     <w:p>
       <w:pPr>
         <w:rPr>
+          <w:lang w:val="es-ES"/>
+        </w:rPr>
+      </w:pPr>
+      <w:r>
+        <w:rPr>
+          <w:lang w:val="es-ES"/>
+        </w:rPr>
+        <w:t>En el exigente entorno universitario, los estudiantes a menudo enfrentan dificultades para mantener un seguimiento exacto y actualizado de sus calificaciones parciales a lo largo del semestre académico. La falta de un control sistemático crea incertidumbre sobre el puntaje acumulado y hace más difícil calcular a tiempo la calificación necesaria en las evaluaciones posteriores para lograr la nota mínima de aprobación (70 puntos).</w:t>
+      </w:r>
+    </w:p>
+    <w:p>
+      <w:pPr>
+        <w:rPr>
+          <w:lang w:val="es-ES"/>
+        </w:rPr>
+      </w:pPr>
+      <w:r>
+        <w:rPr>
+          <w:lang w:val="es-ES"/>
+        </w:rPr>
+        <w:t xml:space="preserve">Asimismo, los errores humanos al calcular promedios de forma manual llevan a proyecciones equivocadas sobre la situación final del alumno. Se hace imperativa una solución basada en algoritmos que sea robusta, intuitiva y a prueba de fallos mediante el manejo de excepciones (Python Software </w:t>
+      </w:r>
+      <w:proofErr w:type="spellStart"/>
+      <w:r>
+        <w:rPr>
+          <w:lang w:val="es-ES"/>
+        </w:rPr>
+        <w:t>Foundation</w:t>
+      </w:r>
+      <w:proofErr w:type="spellEnd"/>
+      <w:r>
+        <w:rPr>
+          <w:lang w:val="es-ES"/>
+        </w:rPr>
+        <w:t>, 2024b), la cual procese tanto los registros históricos de evaluaciones como las nuevas entradas, y que determine automáticamente el estado académico, la proyección de aprobación y las principales métricas de desempeño del estudiante.</w:t>
+      </w:r>
+    </w:p>
+    <w:p>
+      <w:pPr>
+        <w:rPr>
+          <w:lang w:val="es-ES"/>
+        </w:rPr>
+      </w:pPr>
+    </w:p>
+    <w:p>
+      <w:pPr>
+        <w:rPr>
+          <w:lang w:val="es-ES"/>
+        </w:rPr>
+      </w:pPr>
+    </w:p>
+    <w:p>
+      <w:pPr>
+        <w:rPr>
+          <w:lang w:val="es-ES"/>
+        </w:rPr>
+      </w:pPr>
+    </w:p>
+    <w:p>
+      <w:pPr>
+        <w:rPr>
+          <w:lang w:val="es-ES"/>
+        </w:rPr>
+      </w:pPr>
+    </w:p>
+    <w:p>
+      <w:pPr>
+        <w:rPr>
+          <w:lang w:val="es-ES"/>
+        </w:rPr>
+      </w:pPr>
+    </w:p>
+    <w:p>
+      <w:pPr>
+        <w:rPr>
+          <w:lang w:val="es-ES"/>
+        </w:rPr>
+      </w:pPr>
+    </w:p>
+    <w:p>
+      <w:pPr>
+        <w:rPr>
+          <w:lang w:val="es-ES"/>
+        </w:rPr>
+      </w:pPr>
+    </w:p>
+    <w:p>
+      <w:pPr>
+        <w:pStyle w:val="Ttulo1"/>
+      </w:pPr>
+      <w:bookmarkStart w:id="3" w:name="_Toc237600723"/>
+      <w:r>
+        <w:rPr>
+          <w:noProof/>
+        </w:rPr>
+        <w:drawing>
+          <wp:anchor distT="0" distB="0" distL="114300" distR="114300" simplePos="0" relativeHeight="251659265" behindDoc="0" locked="0" layoutInCell="1" allowOverlap="1" wp14:anchorId="1388C584" wp14:editId="7BC05299">
+            <wp:simplePos x="0" y="0"/>
+            <wp:positionH relativeFrom="margin">
+              <wp:align>center</wp:align>
+            </wp:positionH>
+            <wp:positionV relativeFrom="paragraph">
+              <wp:posOffset>375699</wp:posOffset>
+            </wp:positionV>
+            <wp:extent cx="3695700" cy="7424420"/>
+            <wp:effectExtent l="19050" t="19050" r="19050" b="24130"/>
+            <wp:wrapNone/>
+            <wp:docPr id="2" name="Imagen 2"/>
+            <wp:cNvGraphicFramePr>
+              <a:graphicFrameLocks xmlns:a="http://schemas.openxmlformats.org/drawingml/2006/main" noChangeAspect="1"/>
+            </wp:cNvGraphicFramePr>
+            <a:graphic xmlns:a="http://schemas.openxmlformats.org/drawingml/2006/main">
+              <a:graphicData uri="http://schemas.openxmlformats.org/drawingml/2006/picture">
+                <pic:pic xmlns:pic="http://schemas.openxmlformats.org/drawingml/2006/picture">
+                  <pic:nvPicPr>
+                    <pic:cNvPr id="0" name="Picture 1"/>
+                    <pic:cNvPicPr>
+                      <a:picLocks noChangeAspect="1" noChangeArrowheads="1"/>
+                    </pic:cNvPicPr>
+                  </pic:nvPicPr>
+                  <pic:blipFill>
+                    <a:blip r:embed="rId11">
+                      <a:extLst>
+                        <a:ext uri="{28A0092B-C50C-407E-A947-70E740481C1C}">
+                          <a14:useLocalDpi xmlns:a14="http://schemas.microsoft.com/office/drawing/2010/main" val="0"/>
+                        </a:ext>
+                      </a:extLst>
+                    </a:blip>
+                    <a:srcRect/>
+                    <a:stretch>
+                      <a:fillRect/>
+                    </a:stretch>
+                  </pic:blipFill>
+                  <pic:spPr bwMode="auto">
+                    <a:xfrm>
+                      <a:off x="0" y="0"/>
+                      <a:ext cx="3695700" cy="7424420"/>
+                    </a:xfrm>
+                    <a:prstGeom prst="rect">
+                      <a:avLst/>
+                    </a:prstGeom>
+                    <a:noFill/>
+                    <a:ln>
+                      <a:solidFill>
+                        <a:schemeClr val="tx1"/>
+                      </a:solidFill>
+                    </a:ln>
+                  </pic:spPr>
+                </pic:pic>
+              </a:graphicData>
+            </a:graphic>
+          </wp:anchor>
+        </w:drawing>
+      </w:r>
+      <w:r>
+        <w:t>Pseudo código de tu algoritmo:</w:t>
+      </w:r>
+      <w:bookmarkEnd w:id="3"/>
+    </w:p>
+    <w:p>
+      <w:pPr>
+        <w:rPr>
           <w:lang w:val="es-NI"/>
         </w:rPr>
       </w:pPr>
-      <w:r>
+    </w:p>
+    <w:p>
+      <w:pPr>
         <w:rPr>
           <w:lang w:val="es-NI"/>
         </w:rPr>
-        <w:t xml:space="preserve">En la universidad, los estudiantes a menudo tienen problemas para mantener un seguimiento exacto y actual de sus calificaciones parciales a lo largo del año académico. La falta de control constante crea incertidumbre sobre la calificación acumulada y hace más difícil detectar a tiempo la puntuación necesaria en las evaluaciones siguientes para lograr la nota mínima de aprobación (70 puntos). </w:t>
-      </w:r>
+      </w:pPr>
     </w:p>
     <w:p>
       <w:pPr>
@@ -1774,20 +1696,184 @@
           <w:lang w:val="es-NI"/>
         </w:rPr>
       </w:pPr>
-      <w:r>
+    </w:p>
+    <w:p>
+      <w:pPr>
         <w:rPr>
           <w:lang w:val="es-NI"/>
         </w:rPr>
-        <w:t>También, los errores al calcular promedios a mano llevan a proyecciones equivocadas sobre el resultado final del alumno. Se necesita una solución basada en algoritmos que sea fácil de usar, probada y disponible, la cual procese tanto datos anteriores de calificaciones como nuevas entradas de los usuarios, y que determine automáticamente el estado académico, la situación final del estudiante y las principales métricas de desempeño.</w:t>
-      </w:r>
+      </w:pPr>
+    </w:p>
+    <w:p>
+      <w:pPr>
+        <w:rPr>
+          <w:lang w:val="es-NI"/>
+        </w:rPr>
+      </w:pPr>
+    </w:p>
+    <w:p>
+      <w:pPr>
+        <w:rPr>
+          <w:lang w:val="es-NI"/>
+        </w:rPr>
+      </w:pPr>
+    </w:p>
+    <w:p>
+      <w:pPr>
+        <w:rPr>
+          <w:lang w:val="es-NI"/>
+        </w:rPr>
+      </w:pPr>
+    </w:p>
+    <w:p>
+      <w:pPr>
+        <w:rPr>
+          <w:lang w:val="es-NI"/>
+        </w:rPr>
+      </w:pPr>
+    </w:p>
+    <w:p>
+      <w:pPr>
+        <w:rPr>
+          <w:lang w:val="es-NI"/>
+        </w:rPr>
+      </w:pPr>
+    </w:p>
+    <w:p>
+      <w:pPr>
+        <w:rPr>
+          <w:lang w:val="es-NI"/>
+        </w:rPr>
+      </w:pPr>
+    </w:p>
+    <w:p>
+      <w:pPr>
+        <w:rPr>
+          <w:lang w:val="es-NI"/>
+        </w:rPr>
+      </w:pPr>
+    </w:p>
+    <w:p>
+      <w:pPr>
+        <w:rPr>
+          <w:lang w:val="es-NI"/>
+        </w:rPr>
+      </w:pPr>
+    </w:p>
+    <w:p>
+      <w:pPr>
+        <w:rPr>
+          <w:lang w:val="es-NI"/>
+        </w:rPr>
+      </w:pPr>
+    </w:p>
+    <w:p>
+      <w:pPr>
+        <w:rPr>
+          <w:lang w:val="es-NI"/>
+        </w:rPr>
+      </w:pPr>
+    </w:p>
+    <w:p>
+      <w:pPr>
+        <w:rPr>
+          <w:lang w:val="es-NI"/>
+        </w:rPr>
+      </w:pPr>
+    </w:p>
+    <w:p>
+      <w:pPr>
+        <w:rPr>
+          <w:lang w:val="es-NI"/>
+        </w:rPr>
+      </w:pPr>
+    </w:p>
+    <w:p>
+      <w:pPr>
+        <w:rPr>
+          <w:lang w:val="es-NI"/>
+        </w:rPr>
+      </w:pPr>
+    </w:p>
+    <w:p>
+      <w:pPr>
+        <w:rPr>
+          <w:lang w:val="es-NI"/>
+        </w:rPr>
+      </w:pPr>
+    </w:p>
+    <w:p>
+      <w:pPr>
+        <w:rPr>
+          <w:lang w:val="es-NI"/>
+        </w:rPr>
+      </w:pPr>
+    </w:p>
+    <w:p>
+      <w:pPr>
+        <w:rPr>
+          <w:lang w:val="es-NI"/>
+        </w:rPr>
+      </w:pPr>
+    </w:p>
+    <w:p>
+      <w:pPr>
+        <w:rPr>
+          <w:lang w:val="es-NI"/>
+        </w:rPr>
+      </w:pPr>
+    </w:p>
+    <w:p>
+      <w:pPr>
+        <w:rPr>
+          <w:lang w:val="es-NI"/>
+        </w:rPr>
+      </w:pPr>
+    </w:p>
+    <w:p>
+      <w:pPr>
+        <w:rPr>
+          <w:lang w:val="es-NI"/>
+        </w:rPr>
+      </w:pPr>
+    </w:p>
+    <w:p>
+      <w:pPr>
+        <w:rPr>
+          <w:lang w:val="es-NI"/>
+        </w:rPr>
+      </w:pPr>
+    </w:p>
+    <w:p>
+      <w:pPr>
+        <w:rPr>
+          <w:lang w:val="es-NI"/>
+        </w:rPr>
+      </w:pPr>
+    </w:p>
+    <w:p>
+      <w:pPr>
+        <w:rPr>
+          <w:lang w:val="es-NI"/>
+        </w:rPr>
+      </w:pPr>
+    </w:p>
+    <w:p>
+      <w:pPr>
+        <w:rPr>
+          <w:lang w:val="es-NI"/>
+        </w:rPr>
+      </w:pPr>
     </w:p>
     <w:p>
       <w:pPr>
         <w:pStyle w:val="Ttulo1"/>
       </w:pPr>
-      <w:r>
-        <w:t>Pseudo código de tu algoritmo:</w:t>
-      </w:r>
+      <w:bookmarkStart w:id="4" w:name="_Toc237600724"/>
+      <w:r>
+        <w:t>Enlace del repositorio:</w:t>
+      </w:r>
+      <w:bookmarkEnd w:id="4"/>
     </w:p>
     <w:p>
       <w:pPr>
@@ -1795,43 +1881,271 @@
           <w:lang w:val="es-NI"/>
         </w:rPr>
       </w:pPr>
+      <w:hyperlink r:id="rId12" w:history="1">
+        <w:r>
+          <w:rPr>
+            <w:rStyle w:val="Hipervnculo"/>
+            <w:lang w:val="es-NI"/>
+          </w:rPr>
+          <w:t>https://github.com/megasaki/proyecto_unidad1.git</w:t>
+        </w:r>
+      </w:hyperlink>
+    </w:p>
+    <w:p>
+      <w:pPr>
+        <w:rPr>
+          <w:lang w:val="es-NI"/>
+        </w:rPr>
+      </w:pPr>
     </w:p>
     <w:p>
       <w:pPr>
         <w:pStyle w:val="Ttulo1"/>
       </w:pPr>
-      <w:r>
-        <w:t>Enlace del repositorio:</w:t>
-      </w:r>
-    </w:p>
-    <w:p>
-      <w:pPr>
+      <w:bookmarkStart w:id="5" w:name="_Toc195415069"/>
+      <w:bookmarkStart w:id="6" w:name="_Toc237600725"/>
+      <w:r>
+        <w:t>Bibliografía</w:t>
+      </w:r>
+      <w:bookmarkEnd w:id="5"/>
+      <w:r>
+        <w:t xml:space="preserve"> consultada:</w:t>
+      </w:r>
+      <w:bookmarkEnd w:id="6"/>
+    </w:p>
+    <w:p>
+      <w:pPr>
+        <w:ind w:firstLine="720"/>
         <w:rPr>
           <w:lang w:val="es-NI"/>
         </w:rPr>
       </w:pPr>
-    </w:p>
-    <w:p>
-      <w:pPr>
-        <w:pStyle w:val="Ttulo1"/>
-        <w:rPr>
-          <w:lang w:eastAsia="es-419"/>
-        </w:rPr>
-      </w:pPr>
-      <w:bookmarkStart w:id="3" w:name="_Toc195415069"/>
-      <w:bookmarkStart w:id="4" w:name="_Toc229847668"/>
-      <w:r>
-        <w:t>Bibliografía</w:t>
-      </w:r>
-      <w:bookmarkEnd w:id="3"/>
-      <w:bookmarkEnd w:id="4"/>
-      <w:r>
-        <w:t xml:space="preserve"> consultada:</w:t>
-      </w:r>
+      <w:proofErr w:type="spellStart"/>
+      <w:r>
+        <w:rPr>
+          <w:lang w:val="en-US"/>
+        </w:rPr>
+        <w:t>JGraph</w:t>
+      </w:r>
+      <w:proofErr w:type="spellEnd"/>
+      <w:r>
+        <w:rPr>
+          <w:lang w:val="en-US"/>
+        </w:rPr>
+        <w:t xml:space="preserve">. (2024). </w:t>
+      </w:r>
+      <w:r>
+        <w:rPr>
+          <w:i/>
+          <w:iCs/>
+          <w:lang w:val="en-US"/>
+        </w:rPr>
+        <w:t>diagrams.net user documentation</w:t>
+      </w:r>
+      <w:r>
+        <w:rPr>
+          <w:lang w:val="en-US"/>
+        </w:rPr>
+        <w:t xml:space="preserve">. </w:t>
+      </w:r>
+      <w:hyperlink r:id="rId13" w:tgtFrame="_blank" w:history="1">
+        <w:r>
+          <w:rPr>
+            <w:rStyle w:val="Hipervnculo"/>
+            <w:lang w:val="en-US"/>
+          </w:rPr>
+          <w:t>https://www.diagrams.net/doc/</w:t>
+        </w:r>
+      </w:hyperlink>
+    </w:p>
+    <w:p>
+      <w:pPr>
+        <w:ind w:firstLine="720"/>
+        <w:rPr>
+          <w:lang w:val="en-US"/>
+        </w:rPr>
+      </w:pPr>
+      <w:r>
+        <w:rPr>
+          <w:lang w:val="en-US"/>
+        </w:rPr>
+        <w:t xml:space="preserve">Lott, S. F., &amp; Phillips, D. (2021). </w:t>
+      </w:r>
+      <w:r>
+        <w:rPr>
+          <w:i/>
+          <w:iCs/>
+          <w:lang w:val="en-US"/>
+        </w:rPr>
+        <w:t>Python object-oriented programming: Build robust and maintainable software with object-oriented design patterns in Python 3</w:t>
+      </w:r>
+      <w:r>
+        <w:rPr>
+          <w:lang w:val="en-US"/>
+        </w:rPr>
+        <w:t xml:space="preserve"> (4.ª ed.). </w:t>
+      </w:r>
+      <w:proofErr w:type="spellStart"/>
+      <w:r>
+        <w:rPr>
+          <w:lang w:val="en-US"/>
+        </w:rPr>
+        <w:t>Packt</w:t>
+      </w:r>
+      <w:proofErr w:type="spellEnd"/>
+      <w:r>
+        <w:rPr>
+          <w:lang w:val="en-US"/>
+        </w:rPr>
+        <w:t xml:space="preserve"> Publishing. </w:t>
+      </w:r>
+      <w:hyperlink r:id="rId14" w:tgtFrame="_blank" w:history="1">
+        <w:r>
+          <w:rPr>
+            <w:rStyle w:val="Hipervnculo"/>
+            <w:lang w:val="en-US"/>
+          </w:rPr>
+          <w:t>https://www.packtpub.com/product/python-object-oriented-programming-fourth-edition/9781801077262</w:t>
+        </w:r>
+      </w:hyperlink>
+    </w:p>
+    <w:p>
+      <w:pPr>
+        <w:ind w:firstLine="720"/>
+        <w:rPr>
+          <w:lang w:val="en-US"/>
+        </w:rPr>
+      </w:pPr>
+      <w:r>
+        <w:rPr>
+          <w:lang w:val="en-US"/>
+        </w:rPr>
+        <w:t xml:space="preserve">Matthes, E. (2023). </w:t>
+      </w:r>
+      <w:r>
+        <w:rPr>
+          <w:i/>
+          <w:iCs/>
+          <w:lang w:val="en-US"/>
+        </w:rPr>
+        <w:t>Python crash course: A hands-on, project-based introduction to programming</w:t>
+      </w:r>
+      <w:r>
+        <w:rPr>
+          <w:lang w:val="en-US"/>
+        </w:rPr>
+        <w:t xml:space="preserve"> (3.ª ed.). No Starch Press. </w:t>
+      </w:r>
+      <w:hyperlink r:id="rId15" w:tgtFrame="_blank" w:history="1">
+        <w:r>
+          <w:rPr>
+            <w:rStyle w:val="Hipervnculo"/>
+            <w:lang w:val="en-US"/>
+          </w:rPr>
+          <w:t>https://nostarch.com/python-crash-course-3rd-edition</w:t>
+        </w:r>
+      </w:hyperlink>
+    </w:p>
+    <w:p>
+      <w:pPr>
+        <w:ind w:firstLine="720"/>
+        <w:rPr>
+          <w:lang w:val="en-US"/>
+        </w:rPr>
+      </w:pPr>
+      <w:r>
+        <w:rPr>
+          <w:lang w:val="en-US"/>
+        </w:rPr>
+        <w:t xml:space="preserve">Python Software Foundation. (2024a). </w:t>
+      </w:r>
+      <w:r>
+        <w:rPr>
+          <w:i/>
+          <w:iCs/>
+          <w:lang w:val="en-US"/>
+        </w:rPr>
+        <w:t xml:space="preserve">El tutorial de Python: </w:t>
+      </w:r>
+      <w:proofErr w:type="spellStart"/>
+      <w:r>
+        <w:rPr>
+          <w:i/>
+          <w:iCs/>
+          <w:lang w:val="en-US"/>
+        </w:rPr>
+        <w:t>Clases</w:t>
+      </w:r>
+      <w:proofErr w:type="spellEnd"/>
+      <w:r>
+        <w:rPr>
+          <w:lang w:val="en-US"/>
+        </w:rPr>
+        <w:t xml:space="preserve">. </w:t>
+      </w:r>
+      <w:hyperlink r:id="rId16" w:tgtFrame="_blank" w:history="1">
+        <w:r>
+          <w:rPr>
+            <w:rStyle w:val="Hipervnculo"/>
+            <w:lang w:val="en-US"/>
+          </w:rPr>
+          <w:t>https://docs.python.org/es/3/tutorial/classes.html</w:t>
+        </w:r>
+      </w:hyperlink>
+    </w:p>
+    <w:p>
+      <w:pPr>
+        <w:ind w:firstLine="720"/>
+        <w:rPr>
+          <w:lang w:val="es-ES"/>
+        </w:rPr>
+      </w:pPr>
+      <w:r>
+        <w:rPr>
+          <w:lang w:val="en-US"/>
+        </w:rPr>
+        <w:t xml:space="preserve">Python Software Foundation. </w:t>
+      </w:r>
+      <w:r>
+        <w:rPr>
+          <w:lang w:val="es-ES"/>
+        </w:rPr>
+        <w:t xml:space="preserve">(2024b). </w:t>
+      </w:r>
+      <w:r>
+        <w:rPr>
+          <w:i/>
+          <w:iCs/>
+          <w:lang w:val="es-ES"/>
+        </w:rPr>
+        <w:t>El tutorial de Python: Errores y excepciones</w:t>
+      </w:r>
+      <w:r>
+        <w:rPr>
+          <w:lang w:val="es-ES"/>
+        </w:rPr>
+        <w:t xml:space="preserve">. </w:t>
+      </w:r>
+      <w:hyperlink r:id="rId17" w:tgtFrame="_blank" w:history="1">
+        <w:r>
+          <w:rPr>
+            <w:rStyle w:val="Hipervnculo"/>
+            <w:lang w:val="es-ES"/>
+          </w:rPr>
+          <w:t>https://docs.python.org/es/3/tutorial/errors.html</w:t>
+        </w:r>
+      </w:hyperlink>
+    </w:p>
+    <w:p>
+      <w:pPr>
+        <w:rPr>
+          <w:lang w:val="es-NI"/>
+        </w:rPr>
+      </w:pPr>
     </w:p>
     <w:sectPr>
-      <w:headerReference w:type="first" r:id="rId11"/>
-      <w:footerReference w:type="first" r:id="rId12"/>
+      <w:headerReference w:type="first" r:id="rId18"/>
+      <w:footerReference w:type="first" r:id="rId19"/>
       <w:pgSz w:w="12240" w:h="15840"/>
       <w:pgMar w:top="1417" w:right="1701" w:bottom="1417" w:left="1701" w:header="708" w:footer="708" w:gutter="0"/>
       <w:pgNumType w:start="1"/>
@@ -4577,7 +4891,7 @@
     <w:autoRedefine/>
     <w:uiPriority w:val="9"/>
     <w:qFormat/>
-    <w:rsid w:val="00134047"/>
+    <w:rsid w:val="004B4168"/>
     <w:pPr>
       <w:outlineLvl w:val="0"/>
     </w:pPr>
@@ -4779,7 +5093,6 @@
   <w:style w:type="character" w:default="1" w:styleId="Fuentedeprrafopredeter">
     <w:name w:val="Default Paragraph Font"/>
     <w:uiPriority w:val="1"/>
-    <w:semiHidden/>
     <w:unhideWhenUsed/>
   </w:style>
   <w:style w:type="table" w:default="1" w:styleId="Tablanormal">
@@ -4809,7 +5122,7 @@
     <w:basedOn w:val="Fuentedeprrafopredeter"/>
     <w:link w:val="Ttulo1"/>
     <w:uiPriority w:val="9"/>
-    <w:rsid w:val="00E61242"/>
+    <w:rsid w:val="004B4168"/>
     <w:rPr>
       <w:rFonts w:ascii="Trebuchet MS" w:hAnsi="Trebuchet MS"/>
       <w:b/>
@@ -5485,6 +5798,18 @@
       <w14:ligatures w14:val="none"/>
     </w:rPr>
   </w:style>
+  <w:style w:type="character" w:styleId="Mencinsinresolver">
+    <w:name w:val="Unresolved Mention"/>
+    <w:basedOn w:val="Fuentedeprrafopredeter"/>
+    <w:uiPriority w:val="99"/>
+    <w:semiHidden/>
+    <w:unhideWhenUsed/>
+    <w:rsid w:val="00E1018A"/>
+    <w:rPr>
+      <w:color w:val="605E5C"/>
+      <w:shd w:val="clear" w:color="auto" w:fill="E1DFDD"/>
+    </w:rPr>
+  </w:style>
 </w:styles>
 </file>
 

</xml_diff>

<commit_message>
Actualiza notebook e informe de la unidad 1
</commit_message>
<xml_diff>
--- a/informe_unidad1.docx
+++ b/informe_unidad1.docx
@@ -382,6 +382,80 @@
           <w:lang w:eastAsia="es-419"/>
         </w:rPr>
       </w:pPr>
+      <w:r>
+        <w:rPr>
+          <w:rFonts w:ascii="Arial" w:hAnsi="Arial" w:cs="Arial"/>
+          <w:noProof/>
+          <w:color w:val="103654"/>
+          <w:sz w:val="32"/>
+          <w:szCs w:val="32"/>
+        </w:rPr>
+        <w:drawing>
+          <wp:anchor distT="0" distB="0" distL="114300" distR="114300" simplePos="0" relativeHeight="251660289" behindDoc="0" locked="0" layoutInCell="1" allowOverlap="1" wp14:anchorId="0A0C4E4F" wp14:editId="0F96EDD8">
+            <wp:simplePos x="0" y="0"/>
+            <wp:positionH relativeFrom="margin">
+              <wp:posOffset>1630383</wp:posOffset>
+            </wp:positionH>
+            <wp:positionV relativeFrom="paragraph">
+              <wp:posOffset>177301</wp:posOffset>
+            </wp:positionV>
+            <wp:extent cx="2138680" cy="1963420"/>
+            <wp:effectExtent l="0" t="0" r="0" b="0"/>
+            <wp:wrapNone/>
+            <wp:docPr id="3" name="Imagen 3"/>
+            <wp:cNvGraphicFramePr>
+              <a:graphicFrameLocks xmlns:a="http://schemas.openxmlformats.org/drawingml/2006/main" noChangeAspect="1"/>
+            </wp:cNvGraphicFramePr>
+            <a:graphic xmlns:a="http://schemas.openxmlformats.org/drawingml/2006/main">
+              <a:graphicData uri="http://schemas.openxmlformats.org/drawingml/2006/picture">
+                <pic:pic xmlns:pic="http://schemas.openxmlformats.org/drawingml/2006/picture">
+                  <pic:nvPicPr>
+                    <pic:cNvPr id="1" name=""/>
+                    <pic:cNvPicPr/>
+                  </pic:nvPicPr>
+                  <pic:blipFill>
+                    <a:blip r:embed="rId9">
+                      <a:extLst>
+                        <a:ext uri="{BEBA8EAE-BF5A-486C-A8C5-ECC9F3942E4B}">
+                          <a14:imgProps xmlns:a14="http://schemas.microsoft.com/office/drawing/2010/main">
+                            <a14:imgLayer r:embed="rId10">
+                              <a14:imgEffect>
+                                <a14:backgroundRemoval t="3736" b="97989" l="9763" r="89974">
+                                  <a14:foregroundMark x1="34301" y1="88793" x2="56992" y2="90805"/>
+                                  <a14:foregroundMark x1="56992" y1="90805" x2="55673" y2="89943"/>
+                                  <a14:foregroundMark x1="48813" y1="95115" x2="48813" y2="95115"/>
+                                  <a14:foregroundMark x1="50132" y1="97989" x2="50132" y2="97989"/>
+                                  <a14:foregroundMark x1="51979" y1="9195" x2="51979" y2="9195"/>
+                                  <a14:foregroundMark x1="50660" y1="3736" x2="50660" y2="3736"/>
+                                </a14:backgroundRemoval>
+                              </a14:imgEffect>
+                            </a14:imgLayer>
+                          </a14:imgProps>
+                        </a:ext>
+                        <a:ext uri="{28A0092B-C50C-407E-A947-70E740481C1C}">
+                          <a14:useLocalDpi xmlns:a14="http://schemas.microsoft.com/office/drawing/2010/main" val="0"/>
+                        </a:ext>
+                      </a:extLst>
+                    </a:blip>
+                    <a:stretch>
+                      <a:fillRect/>
+                    </a:stretch>
+                  </pic:blipFill>
+                  <pic:spPr>
+                    <a:xfrm>
+                      <a:off x="0" y="0"/>
+                      <a:ext cx="2138680" cy="1963420"/>
+                    </a:xfrm>
+                    <a:prstGeom prst="rect">
+                      <a:avLst/>
+                    </a:prstGeom>
+                  </pic:spPr>
+                </pic:pic>
+              </a:graphicData>
+            </a:graphic>
+          </wp:anchor>
+        </w:drawing>
+      </w:r>
     </w:p>
     <w:p>
       <w:pPr>
@@ -408,7 +482,11 @@
           <w:szCs w:val="32"/>
         </w:rPr>
       </w:pPr>
-      <w:r>
+    </w:p>
+    <w:p>
+      <w:pPr>
+        <w:spacing w:after="0"/>
+        <w:jc w:val="center"/>
         <w:rPr>
           <w:rFonts w:ascii="Arial" w:hAnsi="Arial" w:cs="Arial"/>
           <w:noProof/>
@@ -416,9 +494,12 @@
           <w:sz w:val="32"/>
           <w:szCs w:val="32"/>
         </w:rPr>
-        <w:t>LOGO, IMAGEN</w:t>
-      </w:r>
-      <w:r>
+      </w:pPr>
+    </w:p>
+    <w:p>
+      <w:pPr>
+        <w:spacing w:after="0"/>
+        <w:jc w:val="center"/>
         <w:rPr>
           <w:rFonts w:ascii="Arial" w:hAnsi="Arial" w:cs="Arial"/>
           <w:noProof/>
@@ -426,8 +507,7 @@
           <w:sz w:val="32"/>
           <w:szCs w:val="32"/>
         </w:rPr>
-        <w:t xml:space="preserve"> (Alusiva a su trabajo)</w:t>
-      </w:r>
+      </w:pPr>
     </w:p>
     <w:p>
       <w:pPr>
@@ -447,6 +527,19 @@
         <w:spacing w:after="0"/>
         <w:jc w:val="center"/>
         <w:rPr>
+          <w:rFonts w:ascii="Arial" w:hAnsi="Arial" w:cs="Arial"/>
+          <w:noProof/>
+          <w:color w:val="103654"/>
+          <w:sz w:val="32"/>
+          <w:szCs w:val="32"/>
+        </w:rPr>
+      </w:pPr>
+    </w:p>
+    <w:p>
+      <w:pPr>
+        <w:spacing w:after="0"/>
+        <w:jc w:val="center"/>
+        <w:rPr>
           <w:rFonts w:ascii="Arial" w:eastAsia="Times New Roman" w:hAnsi="Arial" w:cs="Arial"/>
           <w:color w:val="103654"/>
           <w:sz w:val="32"/>
@@ -502,18 +595,6 @@
         </w:rPr>
         <w:t>3</w:t>
       </w:r>
-    </w:p>
-    <w:p>
-      <w:pPr>
-        <w:spacing w:after="0"/>
-        <w:jc w:val="center"/>
-        <w:rPr>
-          <w:rFonts w:ascii="Arial" w:hAnsi="Arial" w:cs="Arial"/>
-          <w:color w:val="103654"/>
-          <w:sz w:val="32"/>
-          <w:szCs w:val="32"/>
-        </w:rPr>
-      </w:pPr>
     </w:p>
     <w:p>
       <w:pPr>
@@ -756,8 +837,9 @@
           <w:lang w:val="es-NI" w:eastAsia="es-NI"/>
           <w14:ligatures w14:val="standardContextual"/>
         </w:rPr>
+        <w:lastRenderedPageBreak/>
         <w:drawing>
-          <wp:anchor distT="0" distB="0" distL="114300" distR="114300" simplePos="0" relativeHeight="251658241" behindDoc="0" locked="0" layoutInCell="1" allowOverlap="1" wp14:anchorId="09CE0197" wp14:editId="1D826F6C">
+          <wp:anchor distT="0" distB="0" distL="114300" distR="114300" simplePos="0" relativeHeight="251658241" behindDoc="0" locked="0" layoutInCell="1" allowOverlap="1" wp14:anchorId="09CE0197" wp14:editId="2C2F2AA5">
             <wp:simplePos x="0" y="0"/>
             <wp:positionH relativeFrom="margin">
               <wp:posOffset>-819807</wp:posOffset>
@@ -780,7 +862,7 @@
                     <pic:cNvPicPr/>
                   </pic:nvPicPr>
                   <pic:blipFill>
-                    <a:blip r:embed="rId9" cstate="print">
+                    <a:blip r:embed="rId11" cstate="print">
                       <a:extLst>
                         <a:ext uri="{28A0092B-C50C-407E-A947-70E740481C1C}">
                           <a14:useLocalDpi xmlns:a14="http://schemas.microsoft.com/office/drawing/2010/main" val="0"/>
@@ -817,6 +899,8 @@
       <w:sdtPr>
         <w:rPr>
           <w:rFonts w:ascii="Trebuchet MS" w:eastAsiaTheme="minorEastAsia" w:hAnsi="Trebuchet MS" w:cstheme="minorBidi"/>
+          <w:b w:val="0"/>
+          <w:bCs w:val="0"/>
           <w:color w:val="auto"/>
           <w:sz w:val="22"/>
           <w:szCs w:val="22"/>
@@ -828,12 +912,6 @@
           <w:docPartUnique/>
         </w:docPartObj>
       </w:sdtPr>
-      <w:sdtEndPr>
-        <w:rPr>
-          <w:b w:val="0"/>
-          <w:bCs w:val="0"/>
-        </w:rPr>
-      </w:sdtEndPr>
       <w:sdtContent>
         <w:p>
           <w:pPr>
@@ -1360,7 +1438,7 @@
           <w:lang w:eastAsia="es-419"/>
         </w:rPr>
         <w:sectPr>
-          <w:footerReference w:type="default" r:id="rId10"/>
+          <w:footerReference w:type="default" r:id="rId12"/>
           <w:pgSz w:w="12240" w:h="15840"/>
           <w:pgMar w:top="1417" w:right="1701" w:bottom="1417" w:left="1701" w:header="708" w:footer="708" w:gutter="0"/>
           <w:pgNumType w:start="1"/>
@@ -1638,7 +1716,7 @@
                     </pic:cNvPicPr>
                   </pic:nvPicPr>
                   <pic:blipFill>
-                    <a:blip r:embed="rId11">
+                    <a:blip r:embed="rId13">
                       <a:extLst>
                         <a:ext uri="{28A0092B-C50C-407E-A947-70E740481C1C}">
                           <a14:useLocalDpi xmlns:a14="http://schemas.microsoft.com/office/drawing/2010/main" val="0"/>
@@ -1881,7 +1959,7 @@
           <w:lang w:val="es-NI"/>
         </w:rPr>
       </w:pPr>
-      <w:hyperlink r:id="rId12" w:history="1">
+      <w:hyperlink r:id="rId14" w:history="1">
         <w:r>
           <w:rPr>
             <w:rStyle w:val="Hipervnculo"/>
@@ -1917,20 +1995,20 @@
       <w:pPr>
         <w:ind w:firstLine="720"/>
         <w:rPr>
-          <w:lang w:val="es-NI"/>
+          <w:lang w:val="en-US"/>
         </w:rPr>
       </w:pPr>
       <w:proofErr w:type="spellStart"/>
       <w:r>
         <w:rPr>
-          <w:lang w:val="en-US"/>
+          <w:lang w:val="es-ES"/>
         </w:rPr>
         <w:t>JGraph</w:t>
       </w:r>
       <w:proofErr w:type="spellEnd"/>
       <w:r>
         <w:rPr>
-          <w:lang w:val="en-US"/>
+          <w:lang w:val="es-ES"/>
         </w:rPr>
         <w:t xml:space="preserve">. (2024). </w:t>
       </w:r>
@@ -1938,17 +2016,45 @@
         <w:rPr>
           <w:i/>
           <w:iCs/>
-          <w:lang w:val="en-US"/>
-        </w:rPr>
-        <w:t>diagrams.net user documentation</w:t>
-      </w:r>
-      <w:r>
-        <w:rPr>
-          <w:lang w:val="en-US"/>
+          <w:lang w:val="es-ES"/>
+        </w:rPr>
+        <w:t xml:space="preserve">diagrams.net </w:t>
+      </w:r>
+      <w:proofErr w:type="spellStart"/>
+      <w:r>
+        <w:rPr>
+          <w:i/>
+          <w:iCs/>
+          <w:lang w:val="es-ES"/>
+        </w:rPr>
+        <w:t>user</w:t>
+      </w:r>
+      <w:proofErr w:type="spellEnd"/>
+      <w:r>
+        <w:rPr>
+          <w:i/>
+          <w:iCs/>
+          <w:lang w:val="es-ES"/>
+        </w:rPr>
+        <w:t xml:space="preserve"> </w:t>
+      </w:r>
+      <w:proofErr w:type="spellStart"/>
+      <w:r>
+        <w:rPr>
+          <w:i/>
+          <w:iCs/>
+          <w:lang w:val="es-ES"/>
+        </w:rPr>
+        <w:t>documentation</w:t>
+      </w:r>
+      <w:proofErr w:type="spellEnd"/>
+      <w:r>
+        <w:rPr>
+          <w:lang w:val="es-ES"/>
         </w:rPr>
         <w:t xml:space="preserve">. </w:t>
       </w:r>
-      <w:hyperlink r:id="rId13" w:tgtFrame="_blank" w:history="1">
+      <w:hyperlink r:id="rId15" w:tgtFrame="_blank" w:history="1">
         <w:r>
           <w:rPr>
             <w:rStyle w:val="Hipervnculo"/>
@@ -1999,7 +2105,7 @@
         </w:rPr>
         <w:t xml:space="preserve"> Publishing. </w:t>
       </w:r>
-      <w:hyperlink r:id="rId14" w:tgtFrame="_blank" w:history="1">
+      <w:hyperlink r:id="rId16" w:tgtFrame="_blank" w:history="1">
         <w:r>
           <w:rPr>
             <w:rStyle w:val="Hipervnculo"/>
@@ -2036,7 +2142,7 @@
         </w:rPr>
         <w:t xml:space="preserve"> (3.ª ed.). No Starch Press. </w:t>
       </w:r>
-      <w:hyperlink r:id="rId15" w:tgtFrame="_blank" w:history="1">
+      <w:hyperlink r:id="rId17" w:tgtFrame="_blank" w:history="1">
         <w:r>
           <w:rPr>
             <w:rStyle w:val="Hipervnculo"/>
@@ -2083,7 +2189,7 @@
         </w:rPr>
         <w:t xml:space="preserve">. </w:t>
       </w:r>
-      <w:hyperlink r:id="rId16" w:tgtFrame="_blank" w:history="1">
+      <w:hyperlink r:id="rId18" w:tgtFrame="_blank" w:history="1">
         <w:r>
           <w:rPr>
             <w:rStyle w:val="Hipervnculo"/>
@@ -2126,7 +2232,7 @@
         </w:rPr>
         <w:t xml:space="preserve">. </w:t>
       </w:r>
-      <w:hyperlink r:id="rId17" w:tgtFrame="_blank" w:history="1">
+      <w:hyperlink r:id="rId19" w:tgtFrame="_blank" w:history="1">
         <w:r>
           <w:rPr>
             <w:rStyle w:val="Hipervnculo"/>
@@ -2144,8 +2250,8 @@
       </w:pPr>
     </w:p>
     <w:sectPr>
-      <w:headerReference w:type="first" r:id="rId18"/>
-      <w:footerReference w:type="first" r:id="rId19"/>
+      <w:headerReference w:type="first" r:id="rId20"/>
+      <w:footerReference w:type="first" r:id="rId21"/>
       <w:pgSz w:w="12240" w:h="15840"/>
       <w:pgMar w:top="1417" w:right="1701" w:bottom="1417" w:left="1701" w:header="708" w:footer="708" w:gutter="0"/>
       <w:pgNumType w:start="1"/>
@@ -5093,6 +5199,7 @@
   <w:style w:type="character" w:default="1" w:styleId="Fuentedeprrafopredeter">
     <w:name w:val="Default Paragraph Font"/>
     <w:uiPriority w:val="1"/>
+    <w:semiHidden/>
     <w:unhideWhenUsed/>
   </w:style>
   <w:style w:type="table" w:default="1" w:styleId="Tablanormal">

</xml_diff>